<commit_message>
From DEC 25 to FEB 11 (3:46)
</commit_message>
<xml_diff>
--- a/FS_Receivable_PaymentReceipt.docx
+++ b/FS_Receivable_PaymentReceipt.docx
@@ -1,6 +1,6 @@
 
 <file path=word/document.xml><?xml version="1.0" encoding="utf-8"?>
-<w:document xmlns:a="http://schemas.openxmlformats.org/drawingml/2006/main" xmlns:pic="http://schemas.openxmlformats.org/drawingml/2006/picture" xmlns:wpc="http://schemas.microsoft.com/office/word/2010/wordprocessingCanvas" xmlns:cx="http://schemas.microsoft.com/office/drawing/2014/chartex" xmlns:cx1="http://schemas.microsoft.com/office/drawing/2015/9/8/chartex" xmlns:cx2="http://schemas.microsoft.com/office/drawing/2015/10/21/chartex" xmlns:cx3="http://schemas.microsoft.com/office/drawing/2016/5/9/chartex" xmlns:cx4="http://schemas.microsoft.com/office/drawing/2016/5/10/chartex" xmlns:cx5="http://schemas.microsoft.com/office/drawing/2016/5/11/chartex" xmlns:cx6="http://schemas.microsoft.com/office/drawing/2016/5/12/chartex" xmlns:cx7="http://schemas.microsoft.com/office/drawing/2016/5/13/chartex" xmlns:cx8="http://schemas.microsoft.com/office/drawing/2016/5/14/chartex" xmlns:mc="http://schemas.openxmlformats.org/markup-compatibility/2006" xmlns:aink="http://schemas.microsoft.com/office/drawing/2016/ink" xmlns:am3d="http://schemas.microsoft.com/office/drawing/2017/model3d" xmlns:o="urn:schemas-microsoft-com:office:office" xmlns:oel="http://schemas.microsoft.com/office/2019/extlst" xmlns:r="http://schemas.openxmlformats.org/officeDocument/2006/relationships" xmlns:m="http://schemas.openxmlformats.org/officeDocument/2006/math" xmlns:v="urn:schemas-microsoft-com:vml" xmlns:wp14="http://schemas.microsoft.com/office/word/2010/wordprocessingDrawing" xmlns:wp="http://schemas.openxmlformats.org/drawingml/2006/wordprocessingDrawing" xmlns:w10="urn:schemas-microsoft-com:office:word" xmlns:w="http://schemas.openxmlformats.org/wordprocessingml/2006/main" xmlns:w14="http://schemas.microsoft.com/office/word/2010/wordml" xmlns:w15="http://schemas.microsoft.com/office/word/2012/wordml" xmlns:w16cex="http://schemas.microsoft.com/office/word/2018/wordml/cex" xmlns:w16cid="http://schemas.microsoft.com/office/word/2016/wordml/cid" xmlns:w16="http://schemas.microsoft.com/office/word/2018/wordml" xmlns:w16du="http://schemas.microsoft.com/office/word/2023/wordml/word16du" xmlns:w16sdtdh="http://schemas.microsoft.com/office/word/2020/wordml/sdtdatahash" xmlns:w16se="http://schemas.microsoft.com/office/word/2015/wordml/symex" xmlns:wpg="http://schemas.microsoft.com/office/word/2010/wordprocessingGroup" xmlns:wpi="http://schemas.microsoft.com/office/word/2010/wordprocessingInk" xmlns:wne="http://schemas.microsoft.com/office/word/2006/wordml" xmlns:wps="http://schemas.microsoft.com/office/word/2010/wordprocessingShape" mc:Ignorable="w14 w15 w16se w16cid w16 w16cex w16sdtdh w16du wp14">
+<w:document xmlns:a="http://schemas.openxmlformats.org/drawingml/2006/main" xmlns:pic="http://schemas.openxmlformats.org/drawingml/2006/picture" xmlns:wpc="http://schemas.microsoft.com/office/word/2010/wordprocessingCanvas" xmlns:cx="http://schemas.microsoft.com/office/drawing/2014/chartex" xmlns:cx1="http://schemas.microsoft.com/office/drawing/2015/9/8/chartex" xmlns:cx2="http://schemas.microsoft.com/office/drawing/2015/10/21/chartex" xmlns:cx3="http://schemas.microsoft.com/office/drawing/2016/5/9/chartex" xmlns:cx4="http://schemas.microsoft.com/office/drawing/2016/5/10/chartex" xmlns:cx5="http://schemas.microsoft.com/office/drawing/2016/5/11/chartex" xmlns:cx6="http://schemas.microsoft.com/office/drawing/2016/5/12/chartex" xmlns:cx7="http://schemas.microsoft.com/office/drawing/2016/5/13/chartex" xmlns:cx8="http://schemas.microsoft.com/office/drawing/2016/5/14/chartex" xmlns:mc="http://schemas.openxmlformats.org/markup-compatibility/2006" xmlns:aink="http://schemas.microsoft.com/office/drawing/2016/ink" xmlns:am3d="http://schemas.microsoft.com/office/drawing/2017/model3d" xmlns:o="urn:schemas-microsoft-com:office:office" xmlns:oel="http://schemas.microsoft.com/office/2019/extlst" xmlns:r="http://schemas.openxmlformats.org/officeDocument/2006/relationships" xmlns:m="http://schemas.openxmlformats.org/officeDocument/2006/math" xmlns:v="urn:schemas-microsoft-com:vml" xmlns:wp14="http://schemas.microsoft.com/office/word/2010/wordprocessingDrawing" xmlns:wp="http://schemas.openxmlformats.org/drawingml/2006/wordprocessingDrawing" xmlns:w10="urn:schemas-microsoft-com:office:word" xmlns:w="http://schemas.openxmlformats.org/wordprocessingml/2006/main" xmlns:w14="http://schemas.microsoft.com/office/word/2010/wordml" xmlns:w15="http://schemas.microsoft.com/office/word/2012/wordml" xmlns:w16cex="http://schemas.microsoft.com/office/word/2018/wordml/cex" xmlns:w16cid="http://schemas.microsoft.com/office/word/2016/wordml/cid" xmlns:w16="http://schemas.microsoft.com/office/word/2018/wordml" xmlns:w16du="http://schemas.microsoft.com/office/word/2023/wordml/word16du" xmlns:w16sdtdh="http://schemas.microsoft.com/office/word/2020/wordml/sdtdatahash" xmlns:w16sdtfl="http://schemas.microsoft.com/office/word/2024/wordml/sdtformatlock" xmlns:w16se="http://schemas.microsoft.com/office/word/2015/wordml/symex" xmlns:wpg="http://schemas.microsoft.com/office/word/2010/wordprocessingGroup" xmlns:wpi="http://schemas.microsoft.com/office/word/2010/wordprocessingInk" xmlns:wne="http://schemas.microsoft.com/office/word/2006/wordml" xmlns:wps="http://schemas.microsoft.com/office/word/2010/wordprocessingShape" mc:Ignorable="w14 w15 w16se w16cid w16 w16cex w16sdtdh w16sdtfl w16du wp14">
   <w:body>
     <w:tbl>
       <w:tblPr>
@@ -37,11 +37,8 @@
               <w:tblLook w:val="04A0" w:firstRow="1" w:lastRow="0" w:firstColumn="1" w:lastColumn="0" w:noHBand="0" w:noVBand="1"/>
             </w:tblPr>
             <w:tblGrid>
-              <w:gridCol w:w="1838"/>
-              <w:gridCol w:w="4394"/>
-              <w:gridCol w:w="2268"/>
-              <w:gridCol w:w="2268"/>
-              <w:gridCol w:w="2268"/>
+              <w:gridCol w:w="6232"/>
+              <w:gridCol w:w="6804"/>
             </w:tblGrid>
             <w:tr>
               <w:trPr>
@@ -68,13 +65,13 @@
                   <w:tc>
                     <w:tcPr>
                       <w:tcW w:w="6232" w:type="dxa"/>
-                      <w:gridSpan w:val="2"/>
                       <w:tcBorders>
                         <w:bottom w:val="nil"/>
                         <w:right w:val="nil"/>
                       </w:tcBorders>
                     </w:tcPr>
                     <w:p>
+                      <w:proofErr w:type="spellStart"/>
                       <w:r>
                         <w:rPr>
                           <w:b/>
@@ -84,6 +81,7 @@
                         </w:rPr>
                         <w:t>CompanyName</w:t>
                       </w:r>
+                      <w:proofErr w:type="spellEnd"/>
                     </w:p>
                   </w:tc>
                 </w:sdtContent>
@@ -91,7 +89,6 @@
               <w:tc>
                 <w:tcPr>
                   <w:tcW w:w="6804" w:type="dxa"/>
-                  <w:gridSpan w:val="3"/>
                   <w:tcBorders>
                     <w:left w:val="nil"/>
                     <w:bottom w:val="nil"/>
@@ -135,7 +132,6 @@
                   <w:tc>
                     <w:tcPr>
                       <w:tcW w:w="6232" w:type="dxa"/>
-                      <w:gridSpan w:val="2"/>
                       <w:tcBorders>
                         <w:top w:val="nil"/>
                         <w:bottom w:val="nil"/>
@@ -143,9 +139,11 @@
                       </w:tcBorders>
                     </w:tcPr>
                     <w:p>
+                      <w:proofErr w:type="spellStart"/>
                       <w:r>
                         <w:t>CompanyAddress</w:t>
                       </w:r>
+                      <w:proofErr w:type="spellEnd"/>
                     </w:p>
                   </w:tc>
                 </w:sdtContent>
@@ -162,7 +160,6 @@
                   <w:tc>
                     <w:tcPr>
                       <w:tcW w:w="6804" w:type="dxa"/>
-                      <w:gridSpan w:val="3"/>
                       <w:vMerge w:val="restart"/>
                       <w:tcBorders>
                         <w:top w:val="nil"/>
@@ -230,7 +227,6 @@
               <w:tc>
                 <w:tcPr>
                   <w:tcW w:w="6232" w:type="dxa"/>
-                  <w:gridSpan w:val="2"/>
                   <w:tcBorders>
                     <w:top w:val="nil"/>
                     <w:bottom w:val="nil"/>
@@ -250,6 +246,7 @@
                       <w:text/>
                     </w:sdtPr>
                     <w:sdtContent>
+                      <w:proofErr w:type="spellStart"/>
                       <w:r>
                         <w:t>CompanyCity</w:t>
                       </w:r>
@@ -273,11 +270,13 @@
                       <w:r>
                         <w:t>CompanyPostcode</w:t>
                       </w:r>
+                      <w:proofErr w:type="spellEnd"/>
                     </w:sdtContent>
                   </w:sdt>
                   <w:r>
                     <w:t xml:space="preserve"> ,</w:t>
                   </w:r>
+                  <w:proofErr w:type="spellStart"/>
                   <w:sdt>
                     <w:sdtPr>
                       <w:alias w:val="#Nav: /FinalSettlement/CompanyCountry"/>
@@ -293,6 +292,7 @@
                       <w:r>
                         <w:t>CompanyCountry</w:t>
                       </w:r>
+                      <w:proofErr w:type="spellEnd"/>
                     </w:sdtContent>
                   </w:sdt>
                 </w:p>
@@ -300,7 +300,6 @@
               <w:tc>
                 <w:tcPr>
                   <w:tcW w:w="6804" w:type="dxa"/>
-                  <w:gridSpan w:val="3"/>
                   <w:vMerge/>
                   <w:tcBorders>
                     <w:top w:val="nil"/>
@@ -316,7 +315,6 @@
               <w:tc>
                 <w:tcPr>
                   <w:tcW w:w="6232" w:type="dxa"/>
-                  <w:gridSpan w:val="2"/>
                   <w:tcBorders>
                     <w:top w:val="nil"/>
                     <w:bottom w:val="nil"/>
@@ -339,9 +337,11 @@
                       <w:text/>
                     </w:sdtPr>
                     <w:sdtContent>
+                      <w:proofErr w:type="spellStart"/>
                       <w:r>
                         <w:t>CompanyPhone</w:t>
                       </w:r>
+                      <w:proofErr w:type="spellEnd"/>
                     </w:sdtContent>
                   </w:sdt>
                 </w:p>
@@ -349,7 +349,6 @@
               <w:tc>
                 <w:tcPr>
                   <w:tcW w:w="6804" w:type="dxa"/>
-                  <w:gridSpan w:val="3"/>
                   <w:vMerge/>
                   <w:tcBorders>
                     <w:top w:val="nil"/>
@@ -365,7 +364,6 @@
               <w:tc>
                 <w:tcPr>
                   <w:tcW w:w="6232" w:type="dxa"/>
-                  <w:gridSpan w:val="2"/>
                   <w:tcBorders>
                     <w:top w:val="nil"/>
                     <w:bottom w:val="nil"/>
@@ -388,9 +386,11 @@
                       <w:text/>
                     </w:sdtPr>
                     <w:sdtContent>
+                      <w:proofErr w:type="spellStart"/>
                       <w:r>
                         <w:t>CompanyEmail</w:t>
                       </w:r>
+                      <w:proofErr w:type="spellEnd"/>
                     </w:sdtContent>
                   </w:sdt>
                 </w:p>
@@ -398,7 +398,6 @@
               <w:tc>
                 <w:tcPr>
                   <w:tcW w:w="6804" w:type="dxa"/>
-                  <w:gridSpan w:val="3"/>
                   <w:vMerge/>
                   <w:tcBorders>
                     <w:top w:val="nil"/>
@@ -414,7 +413,6 @@
               <w:tc>
                 <w:tcPr>
                   <w:tcW w:w="6232" w:type="dxa"/>
-                  <w:gridSpan w:val="2"/>
                   <w:tcBorders>
                     <w:top w:val="nil"/>
                     <w:bottom w:val="nil"/>
@@ -440,9 +438,11 @@
                       <w:text/>
                     </w:sdtPr>
                     <w:sdtContent>
+                      <w:proofErr w:type="spellStart"/>
                       <w:r>
                         <w:t>CompanyTRN</w:t>
                       </w:r>
+                      <w:proofErr w:type="spellEnd"/>
                     </w:sdtContent>
                   </w:sdt>
                 </w:p>
@@ -450,7 +450,6 @@
               <w:tc>
                 <w:tcPr>
                   <w:tcW w:w="6804" w:type="dxa"/>
-                  <w:gridSpan w:val="3"/>
                   <w:vMerge/>
                   <w:tcBorders>
                     <w:top w:val="nil"/>
@@ -466,7 +465,7 @@
               <w:tc>
                 <w:tcPr>
                   <w:tcW w:w="13036" w:type="dxa"/>
-                  <w:gridSpan w:val="5"/>
+                  <w:gridSpan w:val="2"/>
                   <w:tcBorders>
                     <w:top w:val="nil"/>
                   </w:tcBorders>
@@ -478,7 +477,7 @@
               <w:tc>
                 <w:tcPr>
                   <w:tcW w:w="13036" w:type="dxa"/>
-                  <w:gridSpan w:val="5"/>
+                  <w:gridSpan w:val="2"/>
                   <w:tcBorders>
                     <w:bottom w:val="nil"/>
                   </w:tcBorders>
@@ -494,7 +493,7 @@
               <w:tc>
                 <w:tcPr>
                   <w:tcW w:w="13036" w:type="dxa"/>
-                  <w:gridSpan w:val="5"/>
+                  <w:gridSpan w:val="2"/>
                   <w:tcBorders>
                     <w:top w:val="nil"/>
                     <w:bottom w:val="single" w:color="auto" w:sz="4" w:space="0"/>
@@ -521,9 +520,11 @@
                       <w:text/>
                     </w:sdtPr>
                     <w:sdtContent>
+                      <w:proofErr w:type="spellStart"/>
                       <w:r>
                         <w:t>CurrentDate</w:t>
                       </w:r>
+                      <w:proofErr w:type="spellEnd"/>
                     </w:sdtContent>
                   </w:sdt>
                 </w:p>
@@ -533,7 +534,7 @@
               <w:tc>
                 <w:tcPr>
                   <w:tcW w:w="13036" w:type="dxa"/>
-                  <w:gridSpan w:val="5"/>
+                  <w:gridSpan w:val="2"/>
                   <w:tcBorders>
                     <w:left w:val="nil"/>
                     <w:right w:val="nil"/>
@@ -546,7 +547,7 @@
               <w:tc>
                 <w:tcPr>
                   <w:tcW w:w="13036" w:type="dxa"/>
-                  <w:gridSpan w:val="5"/>
+                  <w:gridSpan w:val="2"/>
                   <w:shd w:val="clear" w:color="auto" w:fill="00B0F0"/>
                 </w:tcPr>
                 <w:p>
@@ -606,7 +607,6 @@
                   <w:tc>
                     <w:tcPr>
                       <w:tcW w:w="6232" w:type="dxa"/>
-                      <w:gridSpan w:val="2"/>
                       <w:tcBorders>
                         <w:bottom w:val="nil"/>
                       </w:tcBorders>
@@ -622,7 +622,6 @@
               <w:tc>
                 <w:tcPr>
                   <w:tcW w:w="6804" w:type="dxa"/>
-                  <w:gridSpan w:val="3"/>
                   <w:tcBorders>
                     <w:bottom w:val="nil"/>
                   </w:tcBorders>
@@ -643,9 +642,11 @@
                       <w:text/>
                     </w:sdtPr>
                     <w:sdtContent>
+                      <w:proofErr w:type="spellStart"/>
                       <w:r>
                         <w:t>Contract_ID</w:t>
                       </w:r>
+                      <w:proofErr w:type="spellEnd"/>
                     </w:sdtContent>
                   </w:sdt>
                 </w:p>
@@ -670,7 +671,6 @@
                   <w:tc>
                     <w:tcPr>
                       <w:tcW w:w="6232" w:type="dxa"/>
-                      <w:gridSpan w:val="2"/>
                       <w:tcBorders>
                         <w:top w:val="nil"/>
                         <w:bottom w:val="nil"/>
@@ -687,7 +687,6 @@
               <w:tc>
                 <w:tcPr>
                   <w:tcW w:w="6804" w:type="dxa"/>
-                  <w:gridSpan w:val="3"/>
                   <w:tcBorders>
                     <w:top w:val="nil"/>
                     <w:bottom w:val="nil"/>
@@ -709,9 +708,11 @@
                       <w:text/>
                     </w:sdtPr>
                     <w:sdtContent>
+                      <w:proofErr w:type="spellStart"/>
                       <w:r>
                         <w:t>Property_Name</w:t>
                       </w:r>
+                      <w:proofErr w:type="spellEnd"/>
                     </w:sdtContent>
                   </w:sdt>
                 </w:p>
@@ -724,7 +725,6 @@
               <w:tc>
                 <w:tcPr>
                   <w:tcW w:w="6232" w:type="dxa"/>
-                  <w:gridSpan w:val="2"/>
                   <w:tcBorders>
                     <w:top w:val="nil"/>
                     <w:bottom w:val="nil"/>
@@ -746,8 +746,13 @@
                       <w:text/>
                     </w:sdtPr>
                     <w:sdtContent>
+                      <w:proofErr w:type="spellStart"/>
                       <w:r>
-                        <w:t>Phone_No_</w:t>
+                        <w:t>Phone_No</w:t>
+                      </w:r>
+                      <w:proofErr w:type="spellEnd"/>
+                      <w:r>
+                        <w:t>_</w:t>
                       </w:r>
                     </w:sdtContent>
                   </w:sdt>
@@ -756,7 +761,6 @@
               <w:tc>
                 <w:tcPr>
                   <w:tcW w:w="6804" w:type="dxa"/>
-                  <w:gridSpan w:val="3"/>
                   <w:tcBorders>
                     <w:top w:val="nil"/>
                     <w:bottom w:val="nil"/>
@@ -778,9 +782,11 @@
                       <w:text/>
                     </w:sdtPr>
                     <w:sdtContent>
+                      <w:proofErr w:type="spellStart"/>
                       <w:r>
                         <w:t>Unit_Name</w:t>
                       </w:r>
+                      <w:proofErr w:type="spellEnd"/>
                     </w:sdtContent>
                   </w:sdt>
                 </w:p>
@@ -793,7 +799,6 @@
               <w:tc>
                 <w:tcPr>
                   <w:tcW w:w="6232" w:type="dxa"/>
-                  <w:gridSpan w:val="2"/>
                   <w:tcBorders>
                     <w:top w:val="nil"/>
                     <w:bottom w:val="nil"/>
@@ -815,9 +820,11 @@
                       <w:text/>
                     </w:sdtPr>
                     <w:sdtContent>
+                      <w:proofErr w:type="spellStart"/>
                       <w:r>
                         <w:t>E_Mail</w:t>
                       </w:r>
+                      <w:proofErr w:type="spellEnd"/>
                     </w:sdtContent>
                   </w:sdt>
                 </w:p>
@@ -825,7 +832,6 @@
               <w:tc>
                 <w:tcPr>
                   <w:tcW w:w="6804" w:type="dxa"/>
-                  <w:gridSpan w:val="3"/>
                   <w:tcBorders>
                     <w:top w:val="nil"/>
                     <w:bottom w:val="nil"/>
@@ -847,9 +853,11 @@
                       <w:text/>
                     </w:sdtPr>
                     <w:sdtContent>
+                      <w:proofErr w:type="spellStart"/>
                       <w:r>
                         <w:t>Contract_Start_Date</w:t>
                       </w:r>
+                      <w:proofErr w:type="spellEnd"/>
                     </w:sdtContent>
                   </w:sdt>
                   <w:r>
@@ -870,9 +878,11 @@
                       <w:text/>
                     </w:sdtPr>
                     <w:sdtContent>
+                      <w:proofErr w:type="spellStart"/>
                       <w:r>
                         <w:t>Contract_End_Date</w:t>
                       </w:r>
+                      <w:proofErr w:type="spellEnd"/>
                     </w:sdtContent>
                   </w:sdt>
                 </w:p>
@@ -885,7 +895,6 @@
               <w:tc>
                 <w:tcPr>
                   <w:tcW w:w="6232" w:type="dxa"/>
-                  <w:gridSpan w:val="2"/>
                   <w:tcBorders>
                     <w:top w:val="nil"/>
                   </w:tcBorders>
@@ -906,8 +915,13 @@
                       <w:text/>
                     </w:sdtPr>
                     <w:sdtContent>
+                      <w:proofErr w:type="spellStart"/>
                       <w:r>
-                        <w:t>VAT_Registration_No_</w:t>
+                        <w:t>VAT_Registration_No</w:t>
+                      </w:r>
+                      <w:proofErr w:type="spellEnd"/>
+                      <w:r>
+                        <w:t>_</w:t>
                       </w:r>
                     </w:sdtContent>
                   </w:sdt>
@@ -916,7 +930,6 @@
               <w:tc>
                 <w:tcPr>
                   <w:tcW w:w="6804" w:type="dxa"/>
-                  <w:gridSpan w:val="3"/>
                   <w:tcBorders>
                     <w:top w:val="nil"/>
                   </w:tcBorders>
@@ -937,14 +950,30 @@
                       <w:text/>
                     </w:sdtPr>
                     <w:sdtContent>
+                      <w:proofErr w:type="spellStart"/>
                       <w:r>
                         <w:t>Contract_Tenor</w:t>
                       </w:r>
+                      <w:proofErr w:type="spellEnd"/>
                     </w:sdtContent>
                   </w:sdt>
                 </w:p>
               </w:tc>
             </w:tr>
+          </w:tbl>
+          <w:p/>
+          <w:tbl>
+            <w:tblPr>
+              <w:tblStyle w:val="TableGrid"/>
+              <w:tblpPr w:leftFromText="180" w:rightFromText="180" w:vertAnchor="page" w:horzAnchor="margin" w:tblpX="127" w:tblpY="295"/>
+              <w:tblOverlap w:val="never"/>
+              <w:tblW w:w="0" w:type="auto"/>
+              <w:tblLayout w:type="fixed"/>
+              <w:tblLook w:val="04A0" w:firstRow="1" w:lastRow="0" w:firstColumn="1" w:lastColumn="0" w:noHBand="0" w:noVBand="1"/>
+            </w:tblPr>
+            <w:tblGrid>
+              <w:gridCol w:w="13036"/>
+            </w:tblGrid>
             <w:tr>
               <w:trPr>
                 <w:trHeight w:val="251"/>
@@ -952,7 +981,6 @@
               <w:tc>
                 <w:tcPr>
                   <w:tcW w:w="13036" w:type="dxa"/>
-                  <w:gridSpan w:val="5"/>
                 </w:tcPr>
                 <w:p>
                   <w:pPr>
@@ -972,13 +1000,30 @@
                 </w:p>
               </w:tc>
             </w:tr>
+          </w:tbl>
+          <w:p/>
+          <w:tbl>
+            <w:tblPr>
+              <w:tblStyle w:val="TableGrid"/>
+              <w:tblpPr w:leftFromText="180" w:rightFromText="180" w:vertAnchor="page" w:horzAnchor="margin" w:tblpX="127" w:tblpY="295"/>
+              <w:tblOverlap w:val="never"/>
+              <w:tblW w:w="0" w:type="auto"/>
+              <w:tblLayout w:type="fixed"/>
+              <w:tblLook w:val="04A0" w:firstRow="1" w:lastRow="0" w:firstColumn="1" w:lastColumn="0" w:noHBand="0" w:noVBand="1"/>
+            </w:tblPr>
+            <w:tblGrid>
+              <w:gridCol w:w="6835"/>
+              <w:gridCol w:w="2070"/>
+              <w:gridCol w:w="1800"/>
+              <w:gridCol w:w="2340"/>
+            </w:tblGrid>
             <w:tr>
               <w:trPr>
                 <w:trHeight w:val="250"/>
               </w:trPr>
               <w:tc>
                 <w:tcPr>
-                  <w:tcW w:w="1838" w:type="dxa"/>
+                  <w:tcW w:w="6835" w:type="dxa"/>
                   <w:shd w:val="clear" w:color="auto" w:fill="00B0F0"/>
                 </w:tcPr>
                 <w:p>
@@ -993,13 +1038,13 @@
                       <w:b/>
                       <w:bCs/>
                     </w:rPr>
-                    <w:t>Invoice No</w:t>
+                    <w:t>Description</w:t>
                   </w:r>
                 </w:p>
               </w:tc>
               <w:tc>
                 <w:tcPr>
-                  <w:tcW w:w="4394" w:type="dxa"/>
+                  <w:tcW w:w="2070" w:type="dxa"/>
                   <w:shd w:val="clear" w:color="auto" w:fill="00B0F0"/>
                 </w:tcPr>
                 <w:p>
@@ -1014,13 +1059,13 @@
                       <w:b/>
                       <w:bCs/>
                     </w:rPr>
-                    <w:t>Description</w:t>
+                    <w:t>Payment Mode</w:t>
                   </w:r>
                 </w:p>
               </w:tc>
               <w:tc>
                 <w:tcPr>
-                  <w:tcW w:w="2268" w:type="dxa"/>
+                  <w:tcW w:w="1800" w:type="dxa"/>
                   <w:shd w:val="clear" w:color="auto" w:fill="00B0F0"/>
                 </w:tcPr>
                 <w:p>
@@ -1035,13 +1080,13 @@
                       <w:b/>
                       <w:bCs/>
                     </w:rPr>
-                    <w:t>Payment Mode</w:t>
+                    <w:t>Cheque No</w:t>
                   </w:r>
                 </w:p>
               </w:tc>
               <w:tc>
                 <w:tcPr>
-                  <w:tcW w:w="2268" w:type="dxa"/>
+                  <w:tcW w:w="2340" w:type="dxa"/>
                   <w:shd w:val="clear" w:color="auto" w:fill="00B0F0"/>
                 </w:tcPr>
                 <w:p>
@@ -1056,27 +1101,6 @@
                       <w:b/>
                       <w:bCs/>
                     </w:rPr>
-                    <w:t>Cheque No</w:t>
-                  </w:r>
-                </w:p>
-              </w:tc>
-              <w:tc>
-                <w:tcPr>
-                  <w:tcW w:w="2268" w:type="dxa"/>
-                  <w:shd w:val="clear" w:color="auto" w:fill="00B0F0"/>
-                </w:tcPr>
-                <w:p>
-                  <w:pPr>
-                    <w:rPr>
-                      <w:b/>
-                      <w:bCs/>
-                    </w:rPr>
-                  </w:pPr>
-                  <w:r>
-                    <w:rPr>
-                      <w:b/>
-                      <w:bCs/>
-                    </w:rPr>
                     <w:t>Total Amount</w:t>
                   </w:r>
                 </w:p>
@@ -1086,41 +1110,9 @@
               <w:trPr>
                 <w:trHeight w:val="250"/>
               </w:trPr>
-              <w:sdt>
-                <w:sdtPr>
-                  <w:alias w:val="#Nav: /FinalSettlement/Invoice_ID"/>
-                  <w:tag w:val="#Nav: FS_Receivable_PaymentReceipt/50114"/>
-                  <w:id w:val="-1196623526"/>
-                  <w:placeholder>
-                    <w:docPart w:val="DefaultPlaceholder_-1854013440"/>
-                  </w:placeholder>
-                  <w:dataBinding w:prefixMappings="xmlns:ns0='urn:microsoft-dynamics-nav/reports/FS_Receivable_PaymentReceipt/50114/'" w:xpath="/ns0:NavWordReportXmlPart[1]/ns0:FinalSettlement[1]/ns0:Invoice_ID[1]" w:storeItemID="{097411A5-7817-4F41-BE2B-2CFDAB2FA0CA}"/>
-                  <w:text/>
-                </w:sdtPr>
-                <w:sdtContent>
-                  <w:tc>
-                    <w:tcPr>
-                      <w:tcW w:w="1838" w:type="dxa"/>
-                      <w:shd w:val="clear" w:color="auto" w:fill="auto"/>
-                    </w:tcPr>
-                    <w:p>
-                      <w:pPr>
-                        <w:rPr>
-                          <w:b/>
-                          <w:bCs/>
-                        </w:rPr>
-                      </w:pPr>
-                      <w:r>
-                        <w:t>Invoice_ID</w:t>
-                      </w:r>
-                    </w:p>
-                  </w:tc>
-                </w:sdtContent>
-              </w:sdt>
               <w:tc>
                 <w:tcPr>
-                  <w:tcW w:w="4394" w:type="dxa"/>
-                  <w:shd w:val="clear" w:color="auto" w:fill="auto"/>
+                  <w:tcW w:w="6835" w:type="dxa"/>
                 </w:tcPr>
                 <w:p>
                   <w:pPr>
@@ -1141,14 +1133,7 @@
                       <w:sz w:val="24"/>
                       <w:szCs w:val="24"/>
                     </w:rPr>
-                    <w:t xml:space="preserve"> </w:t>
-                  </w:r>
-                  <w:r>
-                    <w:rPr>
-                      <w:sz w:val="24"/>
-                      <w:szCs w:val="24"/>
-                    </w:rPr>
-                    <w:t xml:space="preserve">– </w:t>
+                    <w:t xml:space="preserve"> – </w:t>
                   </w:r>
                   <w:r>
                     <w:rPr>
@@ -1170,16 +1155,17 @@
                         <w:sz w:val="24"/>
                         <w:szCs w:val="24"/>
                       </w:rPr>
+                      <w:alias w:val="#Nav: /FinalSettlement/Contract_ID"/>
+                      <w:tag w:val="#Nav: FS_Receivable_PaymentReceipt/50114"/>
                       <w:id w:val="-1501491100"/>
                       <w:placeholder>
-                        <w:docPart w:val="DefaultPlaceholder_-1854013440"/>
+                        <w:docPart w:val="717D3964EE064DC485622B0F333551E6"/>
                       </w:placeholder>
                       <w:dataBinding w:prefixMappings="xmlns:ns0='urn:microsoft-dynamics-nav/reports/FS_Receivable_PaymentReceipt/50114/'" w:xpath="/ns0:NavWordReportXmlPart[1]/ns0:FinalSettlement[1]/ns0:Contract_ID[1]" w:storeItemID="{097411A5-7817-4F41-BE2B-2CFDAB2FA0CA}"/>
                       <w:text/>
-                      <w:alias w:val="#Nav: /FinalSettlement/Contract_ID"/>
-                      <w:tag w:val="#Nav: FS_Receivable_PaymentReceipt/50114"/>
                     </w:sdtPr>
                     <w:sdtContent>
+                      <w:proofErr w:type="spellStart"/>
                       <w:r>
                         <w:rPr>
                           <w:sz w:val="24"/>
@@ -1187,6 +1173,7 @@
                         </w:rPr>
                         <w:t>Contract_ID</w:t>
                       </w:r>
+                      <w:proofErr w:type="spellEnd"/>
                     </w:sdtContent>
                   </w:sdt>
                 </w:p>
@@ -1197,7 +1184,7 @@
                   <w:tag w:val="#Nav: FS_Receivable_PaymentReceipt/50114"/>
                   <w:id w:val="283770026"/>
                   <w:placeholder>
-                    <w:docPart w:val="DefaultPlaceholder_-1854013440"/>
+                    <w:docPart w:val="717D3964EE064DC485622B0F333551E6"/>
                   </w:placeholder>
                   <w:dataBinding w:prefixMappings="xmlns:ns0='urn:microsoft-dynamics-nav/reports/FS_Receivable_PaymentReceipt/50114/'" w:xpath="/ns0:NavWordReportXmlPart[1]/ns0:FinalSettlement[1]/ns0:Payment_mode[1]" w:storeItemID="{097411A5-7817-4F41-BE2B-2CFDAB2FA0CA}"/>
                   <w:text/>
@@ -1205,13 +1192,14 @@
                 <w:sdtContent>
                   <w:tc>
                     <w:tcPr>
-                      <w:tcW w:w="2268" w:type="dxa"/>
-                      <w:shd w:val="clear" w:color="auto" w:fill="auto"/>
+                      <w:tcW w:w="2070" w:type="dxa"/>
                     </w:tcPr>
                     <w:p>
+                      <w:proofErr w:type="spellStart"/>
                       <w:r>
                         <w:t>Payment_mode</w:t>
                       </w:r>
+                      <w:proofErr w:type="spellEnd"/>
                     </w:p>
                   </w:tc>
                 </w:sdtContent>
@@ -1222,7 +1210,7 @@
                   <w:tag w:val="#Nav: FS_Receivable_PaymentReceipt/50114"/>
                   <w:id w:val="-642585388"/>
                   <w:placeholder>
-                    <w:docPart w:val="DefaultPlaceholder_-1854013440"/>
+                    <w:docPart w:val="717D3964EE064DC485622B0F333551E6"/>
                   </w:placeholder>
                   <w:dataBinding w:prefixMappings="xmlns:ns0='urn:microsoft-dynamics-nav/reports/FS_Receivable_PaymentReceipt/50114/'" w:xpath="/ns0:NavWordReportXmlPart[1]/ns0:FinalSettlement[1]/ns0:Cheque_No_[1]" w:storeItemID="{097411A5-7817-4F41-BE2B-2CFDAB2FA0CA}"/>
                   <w:text/>
@@ -1230,12 +1218,16 @@
                 <w:sdtContent>
                   <w:tc>
                     <w:tcPr>
-                      <w:tcW w:w="2268" w:type="dxa"/>
-                      <w:shd w:val="clear" w:color="auto" w:fill="auto"/>
+                      <w:tcW w:w="1800" w:type="dxa"/>
                     </w:tcPr>
                     <w:p>
+                      <w:proofErr w:type="spellStart"/>
                       <w:r>
-                        <w:t>Cheque_No_</w:t>
+                        <w:t>Cheque_No</w:t>
+                      </w:r>
+                      <w:proofErr w:type="spellEnd"/>
+                      <w:r>
+                        <w:t>_</w:t>
                       </w:r>
                     </w:p>
                   </w:tc>
@@ -1247,7 +1239,7 @@
                   <w:tag w:val="#Nav: FS_Receivable_PaymentReceipt/50114"/>
                   <w:id w:val="789866209"/>
                   <w:placeholder>
-                    <w:docPart w:val="DefaultPlaceholder_-1854013440"/>
+                    <w:docPart w:val="717D3964EE064DC485622B0F333551E6"/>
                   </w:placeholder>
                   <w:dataBinding w:prefixMappings="xmlns:ns0='urn:microsoft-dynamics-nav/reports/FS_Receivable_PaymentReceipt/50114/'" w:xpath="/ns0:NavWordReportXmlPart[1]/ns0:FinalSettlement[1]/ns0:Total_Amount[1]" w:storeItemID="{097411A5-7817-4F41-BE2B-2CFDAB2FA0CA}"/>
                   <w:text/>
@@ -1255,13 +1247,14 @@
                 <w:sdtContent>
                   <w:tc>
                     <w:tcPr>
-                      <w:tcW w:w="2268" w:type="dxa"/>
-                      <w:shd w:val="clear" w:color="auto" w:fill="auto"/>
+                      <w:tcW w:w="2340" w:type="dxa"/>
                     </w:tcPr>
                     <w:p>
+                      <w:proofErr w:type="spellStart"/>
                       <w:r>
                         <w:t>Total_Amount</w:t>
                       </w:r>
+                      <w:proofErr w:type="spellEnd"/>
                     </w:p>
                   </w:tc>
                 </w:sdtContent>
@@ -1273,8 +1266,8 @@
               </w:trPr>
               <w:tc>
                 <w:tcPr>
-                  <w:tcW w:w="13036" w:type="dxa"/>
-                  <w:gridSpan w:val="5"/>
+                  <w:tcW w:w="13045" w:type="dxa"/>
+                  <w:gridSpan w:val="4"/>
                   <w:tcBorders>
                     <w:bottom w:val="single" w:color="auto" w:sz="4" w:space="0"/>
                   </w:tcBorders>
@@ -1300,7 +1293,7 @@
                     <w:tag w:val="#Nav: FS_Receivable_PaymentReceipt/50114"/>
                     <w:id w:val="1551651119"/>
                     <w:placeholder>
-                      <w:docPart w:val="DefaultPlaceholder_-1854013440"/>
+                      <w:docPart w:val="7964847FEB3C4605A321BA4A5723BA38"/>
                     </w:placeholder>
                     <w:dataBinding w:prefixMappings="xmlns:ns0='urn:microsoft-dynamics-nav/reports/FS_Receivable_PaymentReceipt/50114/'" w:xpath="/ns0:NavWordReportXmlPart[1]/ns0:FinalSettlement[1]/ns0:Final_Settlement_Words[1]" w:storeItemID="{097411A5-7817-4F41-BE2B-2CFDAB2FA0CA}"/>
                     <w:text/>
@@ -1313,9 +1306,11 @@
                           <w:bCs/>
                         </w:rPr>
                       </w:pPr>
+                      <w:proofErr w:type="spellStart"/>
                       <w:r>
                         <w:t>Final_Settlement_Words</w:t>
                       </w:r>
+                      <w:proofErr w:type="spellEnd"/>
                     </w:p>
                   </w:sdtContent>
                 </w:sdt>
@@ -1356,7 +1351,7 @@
 </file>
 
 <file path=word/styles.xml><?xml version="1.0" encoding="utf-8"?>
-<w:styles xmlns:mc="http://schemas.openxmlformats.org/markup-compatibility/2006" xmlns:r="http://schemas.openxmlformats.org/officeDocument/2006/relationships" xmlns:w="http://schemas.openxmlformats.org/wordprocessingml/2006/main" xmlns:w14="http://schemas.microsoft.com/office/word/2010/wordml" xmlns:w15="http://schemas.microsoft.com/office/word/2012/wordml" xmlns:w16cex="http://schemas.microsoft.com/office/word/2018/wordml/cex" xmlns:w16cid="http://schemas.microsoft.com/office/word/2016/wordml/cid" xmlns:w16="http://schemas.microsoft.com/office/word/2018/wordml" xmlns:w16du="http://schemas.microsoft.com/office/word/2023/wordml/word16du" xmlns:w16sdtdh="http://schemas.microsoft.com/office/word/2020/wordml/sdtdatahash" xmlns:w16se="http://schemas.microsoft.com/office/word/2015/wordml/symex" mc:Ignorable="w14 w15 w16se w16cid w16 w16cex w16sdtdh w16du">
+<w:styles xmlns:mc="http://schemas.openxmlformats.org/markup-compatibility/2006" xmlns:r="http://schemas.openxmlformats.org/officeDocument/2006/relationships" xmlns:w="http://schemas.openxmlformats.org/wordprocessingml/2006/main" xmlns:w14="http://schemas.microsoft.com/office/word/2010/wordml" xmlns:w15="http://schemas.microsoft.com/office/word/2012/wordml" xmlns:w16cex="http://schemas.microsoft.com/office/word/2018/wordml/cex" xmlns:w16cid="http://schemas.microsoft.com/office/word/2016/wordml/cid" xmlns:w16="http://schemas.microsoft.com/office/word/2018/wordml" xmlns:w16du="http://schemas.microsoft.com/office/word/2023/wordml/word16du" xmlns:w16sdtdh="http://schemas.microsoft.com/office/word/2020/wordml/sdtdatahash" xmlns:w16sdtfl="http://schemas.microsoft.com/office/word/2024/wordml/sdtformatlock" xmlns:w16se="http://schemas.microsoft.com/office/word/2015/wordml/symex" mc:Ignorable="w14 w15 w16se w16cid w16 w16cex w16sdtdh w16sdtfl w16du">
   <w:docDefaults>
     <w:rPrDefault>
       <w:rPr>
@@ -1759,6 +1754,7 @@
   <w:style w:type="character" w:default="1" w:styleId="DefaultParagraphFont">
     <w:name w:val="Default Paragraph Font"/>
     <w:uiPriority w:val="1"/>
+    <w:semiHidden/>
     <w:unhideWhenUsed/>
   </w:style>
   <w:style w:type="table" w:default="1" w:styleId="TableNormal">
@@ -1815,7 +1811,7 @@
 </file>
 
 <file path=word/glossary/document.xml><?xml version="1.0" encoding="utf-8"?>
-<w:glossaryDocument xmlns:wpc="http://schemas.microsoft.com/office/word/2010/wordprocessingCanvas" xmlns:cx="http://schemas.microsoft.com/office/drawing/2014/chartex" xmlns:cx1="http://schemas.microsoft.com/office/drawing/2015/9/8/chartex" xmlns:cx2="http://schemas.microsoft.com/office/drawing/2015/10/21/chartex" xmlns:cx3="http://schemas.microsoft.com/office/drawing/2016/5/9/chartex" xmlns:cx4="http://schemas.microsoft.com/office/drawing/2016/5/10/chartex" xmlns:cx5="http://schemas.microsoft.com/office/drawing/2016/5/11/chartex" xmlns:cx6="http://schemas.microsoft.com/office/drawing/2016/5/12/chartex" xmlns:cx7="http://schemas.microsoft.com/office/drawing/2016/5/13/chartex" xmlns:cx8="http://schemas.microsoft.com/office/drawing/2016/5/14/chartex" xmlns:mc="http://schemas.openxmlformats.org/markup-compatibility/2006" xmlns:aink="http://schemas.microsoft.com/office/drawing/2016/ink" xmlns:am3d="http://schemas.microsoft.com/office/drawing/2017/model3d" xmlns:o="urn:schemas-microsoft-com:office:office" xmlns:oel="http://schemas.microsoft.com/office/2019/extlst" xmlns:r="http://schemas.openxmlformats.org/officeDocument/2006/relationships" xmlns:m="http://schemas.openxmlformats.org/officeDocument/2006/math" xmlns:v="urn:schemas-microsoft-com:vml" xmlns:wp14="http://schemas.microsoft.com/office/word/2010/wordprocessingDrawing" xmlns:wp="http://schemas.openxmlformats.org/drawingml/2006/wordprocessingDrawing" xmlns:w10="urn:schemas-microsoft-com:office:word" xmlns:w="http://schemas.openxmlformats.org/wordprocessingml/2006/main" xmlns:w14="http://schemas.microsoft.com/office/word/2010/wordml" xmlns:w15="http://schemas.microsoft.com/office/word/2012/wordml" xmlns:w16cex="http://schemas.microsoft.com/office/word/2018/wordml/cex" xmlns:w16cid="http://schemas.microsoft.com/office/word/2016/wordml/cid" xmlns:w16="http://schemas.microsoft.com/office/word/2018/wordml" xmlns:w16du="http://schemas.microsoft.com/office/word/2023/wordml/word16du" xmlns:w16sdtdh="http://schemas.microsoft.com/office/word/2020/wordml/sdtdatahash" xmlns:w16se="http://schemas.microsoft.com/office/word/2015/wordml/symex" xmlns:wpg="http://schemas.microsoft.com/office/word/2010/wordprocessingGroup" xmlns:wpi="http://schemas.microsoft.com/office/word/2010/wordprocessingInk" xmlns:wne="http://schemas.microsoft.com/office/word/2006/wordml" xmlns:wps="http://schemas.microsoft.com/office/word/2010/wordprocessingShape" mc:Ignorable="w14 w15 w16se w16cid w16 w16cex w16sdtdh w16du wp14">
+<w:glossaryDocument xmlns:wpc="http://schemas.microsoft.com/office/word/2010/wordprocessingCanvas" xmlns:cx="http://schemas.microsoft.com/office/drawing/2014/chartex" xmlns:cx1="http://schemas.microsoft.com/office/drawing/2015/9/8/chartex" xmlns:cx2="http://schemas.microsoft.com/office/drawing/2015/10/21/chartex" xmlns:cx3="http://schemas.microsoft.com/office/drawing/2016/5/9/chartex" xmlns:cx4="http://schemas.microsoft.com/office/drawing/2016/5/10/chartex" xmlns:cx5="http://schemas.microsoft.com/office/drawing/2016/5/11/chartex" xmlns:cx6="http://schemas.microsoft.com/office/drawing/2016/5/12/chartex" xmlns:cx7="http://schemas.microsoft.com/office/drawing/2016/5/13/chartex" xmlns:cx8="http://schemas.microsoft.com/office/drawing/2016/5/14/chartex" xmlns:mc="http://schemas.openxmlformats.org/markup-compatibility/2006" xmlns:aink="http://schemas.microsoft.com/office/drawing/2016/ink" xmlns:am3d="http://schemas.microsoft.com/office/drawing/2017/model3d" xmlns:o="urn:schemas-microsoft-com:office:office" xmlns:oel="http://schemas.microsoft.com/office/2019/extlst" xmlns:r="http://schemas.openxmlformats.org/officeDocument/2006/relationships" xmlns:m="http://schemas.openxmlformats.org/officeDocument/2006/math" xmlns:v="urn:schemas-microsoft-com:vml" xmlns:wp14="http://schemas.microsoft.com/office/word/2010/wordprocessingDrawing" xmlns:wp="http://schemas.openxmlformats.org/drawingml/2006/wordprocessingDrawing" xmlns:w10="urn:schemas-microsoft-com:office:word" xmlns:w="http://schemas.openxmlformats.org/wordprocessingml/2006/main" xmlns:w14="http://schemas.microsoft.com/office/word/2010/wordml" xmlns:w15="http://schemas.microsoft.com/office/word/2012/wordml" xmlns:w16cex="http://schemas.microsoft.com/office/word/2018/wordml/cex" xmlns:w16cid="http://schemas.microsoft.com/office/word/2016/wordml/cid" xmlns:w16="http://schemas.microsoft.com/office/word/2018/wordml" xmlns:w16du="http://schemas.microsoft.com/office/word/2023/wordml/word16du" xmlns:w16sdtdh="http://schemas.microsoft.com/office/word/2020/wordml/sdtdatahash" xmlns:w16sdtfl="http://schemas.microsoft.com/office/word/2024/wordml/sdtformatlock" xmlns:w16se="http://schemas.microsoft.com/office/word/2015/wordml/symex" xmlns:wpg="http://schemas.microsoft.com/office/word/2010/wordprocessingGroup" xmlns:wpi="http://schemas.microsoft.com/office/word/2010/wordprocessingInk" xmlns:wne="http://schemas.microsoft.com/office/word/2006/wordml" xmlns:wps="http://schemas.microsoft.com/office/word/2010/wordprocessingShape" mc:Ignorable="w14 w15 w16se w16cid w16 w16cex w16sdtdh w16sdtfl w16du wp14">
   <w:docParts>
     <w:docPart>
       <w:docPartPr>
@@ -1843,12 +1839,70 @@
         </w:p>
       </w:docPartBody>
     </w:docPart>
+    <w:docPart>
+      <w:docPartPr>
+        <w:name w:val="717D3964EE064DC485622B0F333551E6"/>
+        <w:category>
+          <w:name w:val="General"/>
+          <w:gallery w:val="placeholder"/>
+        </w:category>
+        <w:types>
+          <w:type w:val="bbPlcHdr"/>
+        </w:types>
+        <w:behaviors>
+          <w:behavior w:val="content"/>
+        </w:behaviors>
+        <w:guid w:val="{E3874FC2-CDAF-425D-9F7F-347798DDB5C8}"/>
+      </w:docPartPr>
+      <w:docPartBody>
+        <w:p>
+          <w:pPr>
+            <w:pStyle w:val="717D3964EE064DC485622B0F333551E6"/>
+          </w:pPr>
+          <w:r>
+            <w:rPr>
+              <w:rStyle w:val="PlaceholderText"/>
+            </w:rPr>
+            <w:t>Click or tap here to enter text.</w:t>
+          </w:r>
+        </w:p>
+      </w:docPartBody>
+    </w:docPart>
+    <w:docPart>
+      <w:docPartPr>
+        <w:name w:val="7964847FEB3C4605A321BA4A5723BA38"/>
+        <w:category>
+          <w:name w:val="General"/>
+          <w:gallery w:val="placeholder"/>
+        </w:category>
+        <w:types>
+          <w:type w:val="bbPlcHdr"/>
+        </w:types>
+        <w:behaviors>
+          <w:behavior w:val="content"/>
+        </w:behaviors>
+        <w:guid w:val="{184B5280-D506-4EA0-9E04-5F89A49907A0}"/>
+      </w:docPartPr>
+      <w:docPartBody>
+        <w:p>
+          <w:pPr>
+            <w:pStyle w:val="7964847FEB3C4605A321BA4A5723BA38"/>
+          </w:pPr>
+          <w:r>
+            <w:rPr>
+              <w:rStyle w:val="PlaceholderText"/>
+            </w:rPr>
+            <w:t>Click or tap here to enter text.</w:t>
+          </w:r>
+        </w:p>
+      </w:docPartBody>
+    </w:docPart>
   </w:docParts>
 </w:glossaryDocument>
 </file>
 
 <file path=word/glossary/fontTable.xml><?xml version="1.0" encoding="utf-8"?>
-<w:fonts xmlns:mc="http://schemas.openxmlformats.org/markup-compatibility/2006" xmlns:r="http://schemas.openxmlformats.org/officeDocument/2006/relationships" xmlns:w="http://schemas.openxmlformats.org/wordprocessingml/2006/main" xmlns:w14="http://schemas.microsoft.com/office/word/2010/wordml" xmlns:w15="http://schemas.microsoft.com/office/word/2012/wordml" xmlns:w16cex="http://schemas.microsoft.com/office/word/2018/wordml/cex" xmlns:w16cid="http://schemas.microsoft.com/office/word/2016/wordml/cid" xmlns:w16="http://schemas.microsoft.com/office/word/2018/wordml" xmlns:w16du="http://schemas.microsoft.com/office/word/2023/wordml/word16du" xmlns:w16sdtdh="http://schemas.microsoft.com/office/word/2020/wordml/sdtdatahash" xmlns:w16se="http://schemas.microsoft.com/office/word/2015/wordml/symex" mc:Ignorable="w14 w15 w16se w16cid w16 w16cex w16sdtdh w16du">
+<w:fonts xmlns:mc="http://schemas.openxmlformats.org/markup-compatibility/2006" xmlns:r="http://schemas.openxmlformats.org/officeDocument/2006/relationships" xmlns:w="http://schemas.openxmlformats.org/wordprocessingml/2006/main" xmlns:w14="http://schemas.microsoft.com/office/word/2010/wordml" xmlns:w15="http://schemas.microsoft.com/office/word/2012/wordml" xmlns:w16cex="http://schemas.microsoft.com/office/word/2018/wordml/cex" xmlns:w16cid="http://schemas.microsoft.com/office/word/2016/wordml/cid" xmlns:w16="http://schemas.microsoft.com/office/word/2018/wordml" xmlns:w16du="http://schemas.microsoft.com/office/word/2023/wordml/word16du" xmlns:w16sdtdh="http://schemas.microsoft.com/office/word/2020/wordml/sdtdatahash" xmlns:w16sdtfl="http://schemas.microsoft.com/office/word/2024/wordml/sdtformatlock" xmlns:w16se="http://schemas.microsoft.com/office/word/2015/wordml/symex" mc:Ignorable="w14 w15 w16se w16cid w16 w16cex w16sdtdh w16sdtfl w16du">
   <w:font w:name="Calibri">
     <w:panose1 w:val="020F0502020204030204"/>
     <w:charset w:val="00"/>
@@ -1863,6 +1917,13 @@
     <w:pitch w:val="variable"/>
     <w:sig w:usb0="E0002EFF" w:usb1="C000785B" w:usb2="00000009" w:usb3="00000000" w:csb0="000001FF" w:csb1="00000000"/>
   </w:font>
+  <w:font w:name="Arial">
+    <w:panose1 w:val="020B0604020202020204"/>
+    <w:charset w:val="00"/>
+    <w:family w:val="swiss"/>
+    <w:pitch w:val="variable"/>
+    <w:sig w:usb0="E0002EFF" w:usb1="C000785B" w:usb2="00000009" w:usb3="00000000" w:csb0="000001FF" w:csb1="00000000"/>
+  </w:font>
   <w:font w:name="Calibri Light">
     <w:panose1 w:val="020F0302020204030204"/>
     <w:charset w:val="00"/>
@@ -1874,7 +1935,7 @@
 </file>
 
 <file path=word/glossary/settings.xml><?xml version="1.0" encoding="utf-8"?>
-<w:settings xmlns:mc="http://schemas.openxmlformats.org/markup-compatibility/2006" xmlns:o="urn:schemas-microsoft-com:office:office" xmlns:r="http://schemas.openxmlformats.org/officeDocument/2006/relationships" xmlns:m="http://schemas.openxmlformats.org/officeDocument/2006/math" xmlns:v="urn:schemas-microsoft-com:vml" xmlns:w10="urn:schemas-microsoft-com:office:word" xmlns:w="http://schemas.openxmlformats.org/wordprocessingml/2006/main" xmlns:w14="http://schemas.microsoft.com/office/word/2010/wordml" xmlns:w15="http://schemas.microsoft.com/office/word/2012/wordml" xmlns:w16cex="http://schemas.microsoft.com/office/word/2018/wordml/cex" xmlns:w16cid="http://schemas.microsoft.com/office/word/2016/wordml/cid" xmlns:w16="http://schemas.microsoft.com/office/word/2018/wordml" xmlns:w16du="http://schemas.microsoft.com/office/word/2023/wordml/word16du" xmlns:w16sdtdh="http://schemas.microsoft.com/office/word/2020/wordml/sdtdatahash" xmlns:w16se="http://schemas.microsoft.com/office/word/2015/wordml/symex" xmlns:sl="http://schemas.openxmlformats.org/schemaLibrary/2006/main" mc:Ignorable="w14 w15 w16se w16cid w16 w16cex w16sdtdh w16du">
+<w:settings xmlns:mc="http://schemas.openxmlformats.org/markup-compatibility/2006" xmlns:o="urn:schemas-microsoft-com:office:office" xmlns:r="http://schemas.openxmlformats.org/officeDocument/2006/relationships" xmlns:m="http://schemas.openxmlformats.org/officeDocument/2006/math" xmlns:v="urn:schemas-microsoft-com:vml" xmlns:w10="urn:schemas-microsoft-com:office:word" xmlns:w="http://schemas.openxmlformats.org/wordprocessingml/2006/main" xmlns:w14="http://schemas.microsoft.com/office/word/2010/wordml" xmlns:w15="http://schemas.microsoft.com/office/word/2012/wordml" xmlns:w16cex="http://schemas.microsoft.com/office/word/2018/wordml/cex" xmlns:w16cid="http://schemas.microsoft.com/office/word/2016/wordml/cid" xmlns:w16="http://schemas.microsoft.com/office/word/2018/wordml" xmlns:w16du="http://schemas.microsoft.com/office/word/2023/wordml/word16du" xmlns:w16sdtdh="http://schemas.microsoft.com/office/word/2020/wordml/sdtdatahash" xmlns:w16sdtfl="http://schemas.microsoft.com/office/word/2024/wordml/sdtformatlock" xmlns:w16se="http://schemas.microsoft.com/office/word/2015/wordml/symex" xmlns:sl="http://schemas.openxmlformats.org/schemaLibrary/2006/main" mc:Ignorable="w14 w15 w16se w16cid w16 w16cex w16sdtdh w16sdtfl w16du">
   <w:view w:val="normal"/>
   <w:defaultTabStop w:val="720"/>
   <w:characterSpacingControl w:val="doNotCompress"/>
@@ -1889,6 +1950,7 @@
   </w:compat>
   <w:rsids>
     <w:rsidRoot w:val="008A5FEE"/>
+    <w:rsid w:val="000D219B"/>
     <w:rsid w:val="00181FE7"/>
     <w:rsid w:val="001831DA"/>
     <w:rsid w:val="001E7FF6"/>
@@ -1898,10 +1960,12 @@
     <w:rsid w:val="00390782"/>
     <w:rsid w:val="003F2665"/>
     <w:rsid w:val="00493F36"/>
+    <w:rsid w:val="004C0173"/>
     <w:rsid w:val="00551C0B"/>
     <w:rsid w:val="006223D6"/>
     <w:rsid w:val="0068795C"/>
     <w:rsid w:val="007C2514"/>
+    <w:rsid w:val="00827D36"/>
     <w:rsid w:val="00843B89"/>
     <w:rsid w:val="00845F50"/>
     <w:rsid w:val="008A5FEE"/>
@@ -1933,7 +1997,7 @@
     <m:intLim m:val="subSup"/>
     <m:naryLim m:val="undOvr"/>
   </m:mathPr>
-  <w:themeFontLang w:val="en-US"/>
+  <w:themeFontLang w:val="en-US" w:bidi="ar-SA"/>
   <w:clrSchemeMapping w:bg1="light1" w:t1="dark1" w:bg2="light2" w:t2="dark2" w:accent1="accent1" w:accent2="accent2" w:accent3="accent3" w:accent4="accent4" w:accent5="accent5" w:accent6="accent6" w:hyperlink="hyperlink" w:followedHyperlink="followedHyperlink"/>
   <w:decimalSymbol w:val="."/>
   <w:listSeparator w:val=","/>
@@ -1942,7 +2006,7 @@
 </file>
 
 <file path=word/glossary/styles.xml><?xml version="1.0" encoding="utf-8"?>
-<w:styles xmlns:mc="http://schemas.openxmlformats.org/markup-compatibility/2006" xmlns:r="http://schemas.openxmlformats.org/officeDocument/2006/relationships" xmlns:w="http://schemas.openxmlformats.org/wordprocessingml/2006/main" xmlns:w14="http://schemas.microsoft.com/office/word/2010/wordml" xmlns:w15="http://schemas.microsoft.com/office/word/2012/wordml" xmlns:w16cex="http://schemas.microsoft.com/office/word/2018/wordml/cex" xmlns:w16cid="http://schemas.microsoft.com/office/word/2016/wordml/cid" xmlns:w16="http://schemas.microsoft.com/office/word/2018/wordml" xmlns:w16du="http://schemas.microsoft.com/office/word/2023/wordml/word16du" xmlns:w16sdtdh="http://schemas.microsoft.com/office/word/2020/wordml/sdtdatahash" xmlns:w16se="http://schemas.microsoft.com/office/word/2015/wordml/symex" mc:Ignorable="w14 w15 w16se w16cid w16 w16cex w16sdtdh w16du">
+<w:styles xmlns:mc="http://schemas.openxmlformats.org/markup-compatibility/2006" xmlns:r="http://schemas.openxmlformats.org/officeDocument/2006/relationships" xmlns:w="http://schemas.openxmlformats.org/wordprocessingml/2006/main" xmlns:w14="http://schemas.microsoft.com/office/word/2010/wordml" xmlns:w15="http://schemas.microsoft.com/office/word/2012/wordml" xmlns:w16cex="http://schemas.microsoft.com/office/word/2018/wordml/cex" xmlns:w16cid="http://schemas.microsoft.com/office/word/2016/wordml/cid" xmlns:w16="http://schemas.microsoft.com/office/word/2018/wordml" xmlns:w16du="http://schemas.microsoft.com/office/word/2023/wordml/word16du" xmlns:w16sdtdh="http://schemas.microsoft.com/office/word/2020/wordml/sdtdatahash" xmlns:w16sdtfl="http://schemas.microsoft.com/office/word/2024/wordml/sdtformatlock" xmlns:w16se="http://schemas.microsoft.com/office/word/2015/wordml/symex" mc:Ignorable="w14 w15 w16se w16cid w16 w16cex w16sdtdh w16sdtfl w16du">
   <w:docDefaults>
     <w:rPrDefault>
       <w:rPr>
@@ -2374,16 +2438,93 @@
     <w:basedOn w:val="DefaultParagraphFont"/>
     <w:uiPriority w:val="99"/>
     <w:semiHidden/>
-    <w:rsid w:val="008A5FEE"/>
+    <w:rsid w:val="000D219B"/>
     <w:rPr>
       <w:color w:val="666666"/>
+    </w:rPr>
+  </w:style>
+  <w:style w:type="paragraph" w:customStyle="1" w:styleId="D9A6642DE82341299681A0B546B11DD8">
+    <w:name w:val="D9A6642DE82341299681A0B546B11DD8"/>
+    <w:rsid w:val="000D219B"/>
+    <w:pPr>
+      <w:spacing w:line="278" w:lineRule="auto"/>
+    </w:pPr>
+    <w:rPr>
+      <w:sz w:val="24"/>
+      <w:szCs w:val="24"/>
+    </w:rPr>
+  </w:style>
+  <w:style w:type="paragraph" w:customStyle="1" w:styleId="3279DAB5EE84475684551229F6E62480">
+    <w:name w:val="3279DAB5EE84475684551229F6E62480"/>
+    <w:rsid w:val="000D219B"/>
+    <w:pPr>
+      <w:spacing w:line="278" w:lineRule="auto"/>
+    </w:pPr>
+    <w:rPr>
+      <w:sz w:val="24"/>
+      <w:szCs w:val="24"/>
+    </w:rPr>
+  </w:style>
+  <w:style w:type="paragraph" w:customStyle="1" w:styleId="A757353396DA4893926B25C6595F7B29">
+    <w:name w:val="A757353396DA4893926B25C6595F7B29"/>
+    <w:rsid w:val="000D219B"/>
+    <w:pPr>
+      <w:spacing w:line="278" w:lineRule="auto"/>
+    </w:pPr>
+    <w:rPr>
+      <w:sz w:val="24"/>
+      <w:szCs w:val="24"/>
+    </w:rPr>
+  </w:style>
+  <w:style w:type="paragraph" w:customStyle="1" w:styleId="6A6DEBF4112C488E8A7D8D81E14C50BF">
+    <w:name w:val="6A6DEBF4112C488E8A7D8D81E14C50BF"/>
+    <w:rsid w:val="000D219B"/>
+    <w:pPr>
+      <w:spacing w:line="278" w:lineRule="auto"/>
+    </w:pPr>
+    <w:rPr>
+      <w:sz w:val="24"/>
+      <w:szCs w:val="24"/>
+    </w:rPr>
+  </w:style>
+  <w:style w:type="paragraph" w:customStyle="1" w:styleId="9DB2F61C579E4574994D9D69D27EACB3">
+    <w:name w:val="9DB2F61C579E4574994D9D69D27EACB3"/>
+    <w:rsid w:val="000D219B"/>
+    <w:pPr>
+      <w:spacing w:line="278" w:lineRule="auto"/>
+    </w:pPr>
+    <w:rPr>
+      <w:sz w:val="24"/>
+      <w:szCs w:val="24"/>
+    </w:rPr>
+  </w:style>
+  <w:style w:type="paragraph" w:customStyle="1" w:styleId="717D3964EE064DC485622B0F333551E6">
+    <w:name w:val="717D3964EE064DC485622B0F333551E6"/>
+    <w:rsid w:val="000D219B"/>
+    <w:pPr>
+      <w:spacing w:line="278" w:lineRule="auto"/>
+    </w:pPr>
+    <w:rPr>
+      <w:sz w:val="24"/>
+      <w:szCs w:val="24"/>
+    </w:rPr>
+  </w:style>
+  <w:style w:type="paragraph" w:customStyle="1" w:styleId="7964847FEB3C4605A321BA4A5723BA38">
+    <w:name w:val="7964847FEB3C4605A321BA4A5723BA38"/>
+    <w:rsid w:val="000D219B"/>
+    <w:pPr>
+      <w:spacing w:line="278" w:lineRule="auto"/>
+    </w:pPr>
+    <w:rPr>
+      <w:sz w:val="24"/>
+      <w:szCs w:val="24"/>
     </w:rPr>
   </w:style>
 </w:styles>
 </file>
 
 <file path=word/glossary/webSettings.xml><?xml version="1.0" encoding="utf-8"?>
-<w:webSettings xmlns:mc="http://schemas.openxmlformats.org/markup-compatibility/2006" xmlns:r="http://schemas.openxmlformats.org/officeDocument/2006/relationships" xmlns:w="http://schemas.openxmlformats.org/wordprocessingml/2006/main" xmlns:w14="http://schemas.microsoft.com/office/word/2010/wordml" xmlns:w15="http://schemas.microsoft.com/office/word/2012/wordml" xmlns:w16cex="http://schemas.microsoft.com/office/word/2018/wordml/cex" xmlns:w16cid="http://schemas.microsoft.com/office/word/2016/wordml/cid" xmlns:w16="http://schemas.microsoft.com/office/word/2018/wordml" xmlns:w16du="http://schemas.microsoft.com/office/word/2023/wordml/word16du" xmlns:w16sdtdh="http://schemas.microsoft.com/office/word/2020/wordml/sdtdatahash" xmlns:w16se="http://schemas.microsoft.com/office/word/2015/wordml/symex" mc:Ignorable="w14 w15 w16se w16cid w16 w16cex w16sdtdh w16du">
+<w:webSettings xmlns:mc="http://schemas.openxmlformats.org/markup-compatibility/2006" xmlns:r="http://schemas.openxmlformats.org/officeDocument/2006/relationships" xmlns:w="http://schemas.openxmlformats.org/wordprocessingml/2006/main" xmlns:w14="http://schemas.microsoft.com/office/word/2010/wordml" xmlns:w15="http://schemas.microsoft.com/office/word/2012/wordml" xmlns:w16cex="http://schemas.microsoft.com/office/word/2018/wordml/cex" xmlns:w16cid="http://schemas.microsoft.com/office/word/2016/wordml/cid" xmlns:w16="http://schemas.microsoft.com/office/word/2018/wordml" xmlns:w16du="http://schemas.microsoft.com/office/word/2023/wordml/word16du" xmlns:w16sdtdh="http://schemas.microsoft.com/office/word/2020/wordml/sdtdatahash" xmlns:w16sdtfl="http://schemas.microsoft.com/office/word/2024/wordml/sdtformatlock" xmlns:w16se="http://schemas.microsoft.com/office/word/2015/wordml/symex" mc:Ignorable="w14 w15 w16se w16cid w16 w16cex w16sdtdh w16sdtfl w16du">
   <w:optimizeForBrowser/>
   <w:allowPNG/>
 </w:webSettings>
@@ -2768,7 +2909,7 @@
  
          < C o m p a n y P h o n e > C o m p a n y P h o n e < / C o m p a n y P h o n e >   
-         < C o m p a n y P i c t u r e > C o m p a n y P i c t u r e < / C o m p a n y P i c t u r e > +         < C o m p a n y P i c t u r e   / >   
          < C o m p a n y P o s t c o d e > C o m p a n y P o s t c o d e < / C o m p a n y P o s t c o d e >   

</xml_diff>